<commit_message>
decision-log + 0012: Salamisim P3 /live day-of console shipped via PR #1282 (mode override, FaceBlock coverage strip, Kwento queue inline)
Co-Authored-By: Claude Fable 5 <noreply@anthropic.com>
</commit_message>
<xml_diff>
--- a/0012_papic/0012_papic.docx
+++ b/0012_papic/0012_papic.docx
@@ -27027,6 +27027,195 @@
       </w:r>
       <w:r>
         <w:t xml:space="preserve">detection runs on the EXIF-normalized ≤1600px derivative (the wall’s own display cap) with tiling carrying small-face recall — original-res tiling at typical 12–48 MP capture sizes would cost 10–30× the CPU for faces the projection cannot resolve anyway.</w:t>
+      </w:r>
+    </w:p>
+    <w:p>
+      <w:pPr>
+        <w:pStyle w:val="BlockText"/>
+      </w:pPr>
+      <w:r>
+        <w:rPr>
+          <w:b/>
+          <w:bCs/>
+        </w:rPr>
+        <w:t xml:space="preserve">✅ P3 SHIPPED 2026-06-12 (PR #1282, no migration — composition only).</w:t>
+      </w:r>
+      <w:r>
+        <w:t xml:space="preserve"> </w:t>
+      </w:r>
+      <w:r>
+        <w:t xml:space="preserve">The day-of console at</w:t>
+      </w:r>
+      <w:r>
+        <w:t xml:space="preserve"> </w:t>
+      </w:r>
+      <w:r>
+        <w:rPr>
+          <w:rStyle w:val="VerbatimChar"/>
+          <w:b/>
+          <w:bCs/>
+        </w:rPr>
+        <w:t xml:space="preserve">/dashboard/[eventId]/live</w:t>
+      </w:r>
+      <w:r>
+        <w:t xml:space="preserve">, couple OR coordinator (the authority every wall RPC already checks): status counts (on-wall / hidden / screens connected) ·</w:t>
+      </w:r>
+      <w:r>
+        <w:t xml:space="preserve"> </w:t>
+      </w:r>
+      <w:r>
+        <w:rPr>
+          <w:b/>
+          <w:bCs/>
+        </w:rPr>
+        <w:t xml:space="preserve">lifecycle mode control</w:t>
+      </w:r>
+      <w:r>
+        <w:t xml:space="preserve"> </w:t>
+      </w:r>
+      <w:r>
+        <w:t xml:space="preserve">Auto/Teaser/Live/Recap writing</w:t>
+      </w:r>
+      <w:r>
+        <w:t xml:space="preserve"> </w:t>
+      </w:r>
+      <w:r>
+        <w:rPr>
+          <w:rStyle w:val="VerbatimChar"/>
+        </w:rPr>
+        <w:t xml:space="preserve">events.live_mode_override</w:t>
+      </w:r>
+      <w:r>
+        <w:t xml:space="preserve"> </w:t>
+      </w:r>
+      <w:r>
+        <w:t xml:space="preserve">(Auto = NULL, server derives from event date; covers the two real day-of moments — open the wall EARLY, freeze to RECAP at program end) ·</w:t>
+      </w:r>
+      <w:r>
+        <w:t xml:space="preserve"> </w:t>
+      </w:r>
+      <w:r>
+        <w:rPr>
+          <w:b/>
+          <w:bCs/>
+        </w:rPr>
+        <w:t xml:space="preserve">FaceBlock posture strip</w:t>
+      </w:r>
+      <w:r>
+        <w:t xml:space="preserve"> </w:t>
+      </w:r>
+      <w:r>
+        <w:t xml:space="preserve">(blur-ready coverage of recent tiles —</w:t>
+      </w:r>
+      <w:r>
+        <w:t xml:space="preserve"> </w:t>
+      </w:r>
+      <w:r>
+        <w:t xml:space="preserve">“why is the wall thin?”</w:t>
+      </w:r>
+      <w:r>
+        <w:t xml:space="preserve"> </w:t>
+      </w:r>
+      <w:r>
+        <w:t xml:space="preserve">answerable at a glance) · the P1 screen-code + kill-switch controls REUSED at 60 tiles · the Kwento approval queue REUSED inline (the</w:t>
+      </w:r>
+      <w:r>
+        <w:t xml:space="preserve"> </w:t>
+      </w:r>
+      <w:r>
+        <w:t xml:space="preserve">“Kwento lower-thirds”</w:t>
+      </w:r>
+      <w:r>
+        <w:t xml:space="preserve"> </w:t>
+      </w:r>
+      <w:r>
+        <w:t xml:space="preserve">half of this build-order row shipped with Kwento P2’s wall rendering).</w:t>
+      </w:r>
+      <w:r>
+        <w:t xml:space="preserve"> </w:t>
+      </w:r>
+      <w:r>
+        <w:t xml:space="preserve">“Live Wall”</w:t>
+      </w:r>
+      <w:r>
+        <w:t xml:space="preserve"> </w:t>
+      </w:r>
+      <w:r>
+        <w:t xml:space="preserve">nav entry in the Share group; events without LIVE_WALL get a quiet add-on doorway (no price copy).</w:t>
+      </w:r>
+      <w:r>
+        <w:t xml:space="preserve"> </w:t>
+      </w:r>
+      <w:r>
+        <w:rPr>
+          <w:rStyle w:val="VerbatimChar"/>
+        </w:rPr>
+        <w:t xml:space="preserve">setWallMode</w:t>
+      </w:r>
+      <w:r>
+        <w:t xml:space="preserve"> </w:t>
+      </w:r>
+      <w:r>
+        <w:t xml:space="preserve">checks couple/coordinator at app level and writes via the admin client (the shipped</w:t>
+      </w:r>
+      <w:r>
+        <w:t xml:space="preserve"> </w:t>
+      </w:r>
+      <w:r>
+        <w:rPr>
+          <w:rStyle w:val="VerbatimChar"/>
+        </w:rPr>
+        <w:t xml:space="preserve">couple_can_update_event</w:t>
+      </w:r>
+      <w:r>
+        <w:t xml:space="preserve"> </w:t>
+      </w:r>
+      <w:r>
+        <w:t xml:space="preserve">RLS policy is couple-keyed).</w:t>
+      </w:r>
+      <w:r>
+        <w:t xml:space="preserve"> </w:t>
+      </w:r>
+      <w:r>
+        <w:rPr>
+          <w:b/>
+          <w:bCs/>
+        </w:rPr>
+        <w:t xml:space="preserve">Salamisim remaining: P4</w:t>
+      </w:r>
+      <w:r>
+        <w:t xml:space="preserve"> </w:t>
+      </w:r>
+      <w:r>
+        <w:t xml:space="preserve">(SW cache + recap freeze</w:t>
+      </w:r>
+      <w:r>
+        <w:t xml:space="preserve"> </w:t>
+      </w:r>
+      <w:r>
+        <w:rPr>
+          <w:rStyle w:val="VerbatimChar"/>
+        </w:rPr>
+        <w:t xml:space="preserve">wall_freeze_recap</w:t>
+      </w:r>
+      <w:r>
+        <w:t xml:space="preserve">)</w:t>
+      </w:r>
+      <w:r>
+        <w:t xml:space="preserve"> </w:t>
+      </w:r>
+      <w:r>
+        <w:rPr>
+          <w:b/>
+          <w:bCs/>
+        </w:rPr>
+        <w:t xml:space="preserve">· P2b</w:t>
+      </w:r>
+      <w:r>
+        <w:t xml:space="preserve"> </w:t>
+      </w:r>
+      <w:r>
+        <w:t xml:space="preserve">(per-guest selective blur — needs the enroller + a validated embedding model).</w:t>
       </w:r>
     </w:p>
     <w:p>

</xml_diff>

<commit_message>
docs(sessions): S5 is built (PR #5350) — and three corrections it measured
The S5 brief was wrong on three counts, each of which changed the build:
the cover photo is not a publish requirement (one live service has none),
the chat-attachment route it cited as precedent does not exist, and the
chip row it replaces reads the bare category because both live services
have a NULL title — which is why the card must not take its name from
readSnapshot, whose fallback is 'Untitled service'.

Also flags that S5 edited service-card-face.tsx, which S10 and S11 share.

Co-Authored-By: Claude Opus 5 <noreply@anthropic.com>
</commit_message>
<xml_diff>
--- a/0012_papic/0012_papic.docx
+++ b/0012_papic/0012_papic.docx
@@ -2,7 +2,7 @@
 <file path=word/document.xml><?xml version="1.0" encoding="utf-8"?>
 <w:document xmlns:w="http://schemas.openxmlformats.org/wordprocessingml/2006/main" xmlns:m="http://schemas.openxmlformats.org/officeDocument/2006/math" xmlns:r="http://schemas.openxmlformats.org/officeDocument/2006/relationships" xmlns:o="urn:schemas-microsoft-com:office:office" xmlns:v="urn:schemas-microsoft-com:vml" xmlns:w10="urn:schemas-microsoft-com:office:word" xmlns:a="http://schemas.openxmlformats.org/drawingml/2006/main" xmlns:pic="http://schemas.openxmlformats.org/drawingml/2006/picture" xmlns:wp="http://schemas.openxmlformats.org/drawingml/2006/wordprocessingDrawing">
   <w:body>
-    <w:bookmarkStart w:id="25" w:name="iteration-0012-papic"/>
+    <w:bookmarkStart w:id="26" w:name="iteration-0012-papic"/>
     <w:p>
       <w:pPr>
         <w:pStyle w:val="Heading1"/>
@@ -288,9 +288,15 @@
           <w:rPr>
             <w:rStyle w:val="Hyperlink"/>
           </w:rPr>
-          <w:t xml:space="preserve">0012_Camera_Move_Integration_Handoff_2026-06-29.md</w:t>
+          <w:t xml:space="preserve">Vendor_Portfolio_Credits_2026-09-05.md</w:t>
         </w:r>
       </w:hyperlink>
+      <w:r>
+        <w:t xml:space="preserve"> </w:t>
+      </w:r>
+      <w:r>
+        <w:t xml:space="preserve">— a supplier’s own Papic credits: 5% of the booking fee (cap 1,000, no floor) + the ₱500 pack (100 credits since 2026-09-06), landed on approval; replaces the 2026-08-26 ₱5/point allowance</w:t>
+      </w:r>
     </w:p>
     <w:p>
       <w:pPr>
@@ -301,6 +307,23 @@
         </w:numPr>
       </w:pPr>
       <w:hyperlink r:id="rId16">
+        <w:r>
+          <w:rPr>
+            <w:rStyle w:val="Hyperlink"/>
+          </w:rPr>
+          <w:t xml:space="preserve">0012_Camera_Move_Integration_Handoff_2026-06-29.md</w:t>
+        </w:r>
+      </w:hyperlink>
+    </w:p>
+    <w:p>
+      <w:pPr>
+        <w:pStyle w:val="Compact"/>
+        <w:numPr>
+          <w:ilvl w:val="0"/>
+          <w:numId w:val="1002"/>
+        </w:numPr>
+      </w:pPr>
+      <w:hyperlink r:id="rId17">
         <w:r>
           <w:rPr>
             <w:rStyle w:val="Hyperlink"/>
@@ -317,7 +340,7 @@
           <w:numId w:val="1002"/>
         </w:numPr>
       </w:pPr>
-      <w:hyperlink r:id="rId17">
+      <w:hyperlink r:id="rId18">
         <w:r>
           <w:rPr>
             <w:rStyle w:val="Hyperlink"/>
@@ -334,7 +357,7 @@
           <w:numId w:val="1002"/>
         </w:numPr>
       </w:pPr>
-      <w:hyperlink r:id="rId18">
+      <w:hyperlink r:id="rId19">
         <w:r>
           <w:rPr>
             <w:rStyle w:val="Hyperlink"/>
@@ -351,7 +374,7 @@
           <w:numId w:val="1002"/>
         </w:numPr>
       </w:pPr>
-      <w:hyperlink r:id="rId19">
+      <w:hyperlink r:id="rId20">
         <w:r>
           <w:rPr>
             <w:rStyle w:val="Hyperlink"/>
@@ -368,7 +391,7 @@
           <w:numId w:val="1002"/>
         </w:numPr>
       </w:pPr>
-      <w:hyperlink r:id="rId20">
+      <w:hyperlink r:id="rId21">
         <w:r>
           <w:rPr>
             <w:rStyle w:val="Hyperlink"/>
@@ -385,7 +408,7 @@
           <w:numId w:val="1002"/>
         </w:numPr>
       </w:pPr>
-      <w:hyperlink r:id="rId21">
+      <w:hyperlink r:id="rId22">
         <w:r>
           <w:rPr>
             <w:rStyle w:val="Hyperlink"/>
@@ -402,7 +425,7 @@
           <w:numId w:val="1002"/>
         </w:numPr>
       </w:pPr>
-      <w:hyperlink r:id="rId22">
+      <w:hyperlink r:id="rId23">
         <w:r>
           <w:rPr>
             <w:rStyle w:val="Hyperlink"/>
@@ -419,7 +442,7 @@
           <w:numId w:val="1002"/>
         </w:numPr>
       </w:pPr>
-      <w:hyperlink r:id="rId23">
+      <w:hyperlink r:id="rId24">
         <w:r>
           <w:rPr>
             <w:rStyle w:val="Hyperlink"/>
@@ -436,7 +459,7 @@
           <w:numId w:val="1002"/>
         </w:numPr>
       </w:pPr>
-      <w:hyperlink r:id="rId24">
+      <w:hyperlink r:id="rId25">
         <w:r>
           <w:rPr>
             <w:rStyle w:val="Hyperlink"/>
@@ -481,7 +504,7 @@
         <w:t xml:space="preserve">.</w:t>
       </w:r>
     </w:p>
-    <w:bookmarkEnd w:id="25"/>
+    <w:bookmarkEnd w:id="26"/>
     <w:sectPr>
       <w:footnotePr>
         <w:numRestart w:val="eachSect"/>

</xml_diff>